<commit_message>
Update PulseEDU onboarding and request documentation assets
Replit-Commit-Author: Agent
</commit_message>
<xml_diff>
--- a/attached_assets/generated/PulseEDU_Onboarding_Playbook.docx
+++ b/attached_assets/generated/PulseEDU_Onboarding_Playbook.docx
@@ -2,14 +2,61 @@
 <file path=word/document.xml><?xml version="1.0" encoding="utf-8"?>
 <w:document xmlns:wpc="http://schemas.microsoft.com/office/word/2010/wordprocessingCanvas" xmlns:mo="http://schemas.microsoft.com/office/mac/office/2008/main" xmlns:mc="http://schemas.openxmlformats.org/markup-compatibility/2006" xmlns:mv="urn:schemas-microsoft-com:mac:vml" xmlns:o="urn:schemas-microsoft-com:office:office" xmlns:r="http://schemas.openxmlformats.org/officeDocument/2006/relationships" xmlns:m="http://schemas.openxmlformats.org/officeDocument/2006/math" xmlns:v="urn:schemas-microsoft-com:vml" xmlns:wp14="http://schemas.microsoft.com/office/word/2010/wordprocessingDrawing" xmlns:wp="http://schemas.openxmlformats.org/drawingml/2006/wordprocessingDrawing" xmlns:w10="urn:schemas-microsoft-com:office:word" xmlns:w="http://schemas.openxmlformats.org/wordprocessingml/2006/main" xmlns:w14="http://schemas.microsoft.com/office/word/2010/wordml" xmlns:wpg="http://schemas.microsoft.com/office/word/2010/wordprocessingGroup" xmlns:wpi="http://schemas.microsoft.com/office/word/2010/wordprocessingInk" xmlns:wne="http://schemas.microsoft.com/office/word/2006/wordml" xmlns:wps="http://schemas.microsoft.com/office/word/2010/wordprocessingShape" mc:Ignorable="w14 wp14">
   <w:body>
-    <w:p>
-      <w:pPr>
-        <w:pStyle w:val="Title"/>
-      </w:pPr>
-      <w:r>
-        <w:t>PulseEDU New School Onboarding Playbook</w:t>
-      </w:r>
-    </w:p>
+    <w:tbl>
+      <w:tblPr>
+        <w:tblW w:type="auto" w:w="0"/>
+        <w:tblLook w:firstColumn="1" w:firstRow="1" w:lastColumn="0" w:lastRow="0" w:noHBand="0" w:noVBand="1" w:val="04A0"/>
+      </w:tblPr>
+      <w:tblGrid>
+        <w:gridCol w:w="8640"/>
+      </w:tblGrid>
+      <w:tr>
+        <w:tc>
+          <w:tcPr>
+            <w:tcW w:type="dxa" w:w="8640"/>
+            <w:shd w:val="clear" w:fill="4F46E5"/>
+          </w:tcPr>
+          <w:p>
+            <w:pPr>
+              <w:jc w:val="center"/>
+            </w:pPr>
+            <w:r>
+              <w:rPr>
+                <w:b/>
+                <w:color w:val="FFFFFF"/>
+                <w:sz w:val="60"/>
+              </w:rPr>
+              <w:t>PulseEDU</w:t>
+            </w:r>
+          </w:p>
+          <w:p>
+            <w:pPr>
+              <w:jc w:val="center"/>
+            </w:pPr>
+            <w:r>
+              <w:rPr>
+                <w:color w:val="E0E7FF"/>
+                <w:sz w:val="30"/>
+              </w:rPr>
+              <w:t>New School Onboarding Playbook</w:t>
+            </w:r>
+          </w:p>
+          <w:p>
+            <w:pPr>
+              <w:jc w:val="center"/>
+            </w:pPr>
+            <w:r>
+              <w:rPr>
+                <w:i/>
+                <w:color w:val="C7D2FE"/>
+                <w:sz w:val="22"/>
+              </w:rPr>
+              <w:t>Step-by-step setup for Hall Pass and PBIS — in order, with verification checks.</w:t>
+            </w:r>
+          </w:p>
+        </w:tc>
+      </w:tr>
+    </w:tbl>
     <w:p>
       <w:r>
         <w:rPr>
@@ -742,6 +789,7 @@
       </w:r>
     </w:p>
     <w:sectPr>
+      <w:footerReference w:type="default" r:id="rId9"/>
       <w:pgSz w:w="12240" w:h="15840"/>
       <w:pgMar w:top="1440" w:right="1800" w:bottom="1440" w:left="1800" w:header="720" w:footer="720" w:gutter="0"/>
       <w:cols w:space="720"/>
@@ -749,6 +797,24 @@
     </w:sectPr>
   </w:body>
 </w:document>
+</file>
+
+<file path=word/footer1.xml><?xml version="1.0" encoding="utf-8"?>
+<w:ftr xmlns:m="http://schemas.openxmlformats.org/officeDocument/2006/math" xmlns:mc="http://schemas.openxmlformats.org/markup-compatibility/2006" xmlns:mo="http://schemas.microsoft.com/office/mac/office/2008/main" xmlns:mv="urn:schemas-microsoft-com:mac:vml" xmlns:o="urn:schemas-microsoft-com:office:office" xmlns:r="http://schemas.openxmlformats.org/officeDocument/2006/relationships" xmlns:v="urn:schemas-microsoft-com:vml" xmlns:w10="urn:schemas-microsoft-com:office:word" xmlns:w14="http://schemas.microsoft.com/office/word/2010/wordml" xmlns:w="http://schemas.openxmlformats.org/wordprocessingml/2006/main" xmlns:wne="http://schemas.microsoft.com/office/word/2006/wordml" xmlns:wp14="http://schemas.microsoft.com/office/word/2010/wordprocessingDrawing" xmlns:wp="http://schemas.openxmlformats.org/drawingml/2006/wordprocessingDrawing" xmlns:wpc="http://schemas.microsoft.com/office/word/2010/wordprocessingCanvas" xmlns:wpg="http://schemas.microsoft.com/office/word/2010/wordprocessingGroup" xmlns:wpi="http://schemas.microsoft.com/office/word/2010/wordprocessingInk" xmlns:wps="http://schemas.microsoft.com/office/word/2010/wordprocessingShape" mc:Ignorable="w14 wp14">
+  <w:p>
+    <w:pPr>
+      <w:pStyle w:val="Footer"/>
+      <w:jc w:val="center"/>
+    </w:pPr>
+    <w:r>
+      <w:rPr>
+        <w:color w:val="6B7280"/>
+        <w:sz w:val="18"/>
+      </w:rPr>
+      <w:t>PulseEDU • New School Onboarding Playbook</w:t>
+    </w:r>
+  </w:p>
+</w:ftr>
 </file>
 
 <file path=word/numbering.xml><?xml version="1.0" encoding="utf-8"?>

</xml_diff>